<commit_message>
Word export: keep tables as tables, even from crooked photos
- Pages tilted 0.25° or more are straightened before layout analysis.
- Table rules are found where a photo bends them: rows and columns look
  for the rule a little to the side, and line thickness is measured from
  the ink instead of the height a slightly askew rule drifts over. Labels
  in neighbouring merged cells (TOT / USA1 / USA2) no longer run together.
- Small recognition slips are tidied: spaces inside dotted numbers
  ("10.41.22. xx") and a closing bracket missing in a bracketed column.
- The Word review shows tables as tables with merged cells and colours;
  tap a cell to correct it. Lines stay editable fields, and plain-text
  editing is still available.

Co-Authored-By: Claude Opus 5.5 <noreply@anthropic.com>
Claude-Session: https://claude.ai/code/session_01N2KPqXq9Whv7eR2vrvkBWC
</commit_message>
<xml_diff>
--- a/ios/Verification/office-layout/OfficeSampleTable.docx
+++ b/ios/Verification/office-layout/OfficeSampleTable.docx
@@ -20,7 +20,7 @@
     </w:p>
     <w:tbl>
       <w:tblPr>
-        <w:tblW w:w="10064" w:type="dxa"/>
+        <w:tblW w:w="10057" w:type="dxa"/>
         <w:tblInd w:w="20" w:type="dxa"/>
         <w:tblBorders>
           <w:top w:val="nil"/>
@@ -40,7 +40,7 @@
         <w:tblLook w:val="0000"/>
       </w:tblPr>
       <w:tblGrid>
-        <w:gridCol w:w="1024"/>
+        <w:gridCol w:w="1017"/>
         <w:gridCol w:w="2748"/>
         <w:gridCol w:w="3298"/>
         <w:gridCol w:w="1053"/>
@@ -53,7 +53,7 @@
         </w:trPr>
         <w:tc>
           <w:tcPr>
-            <w:tcW w:w="3772" w:type="dxa"/>
+            <w:tcW w:w="3765" w:type="dxa"/>
             <w:gridSpan w:val="2"/>
             <w:vMerge w:val="restart"/>
             <w:tcBorders>
@@ -162,7 +162,7 @@
                 <w:sz w:val="22"/>
                 <w:szCs w:val="22"/>
               </w:rPr>
-              <w:t xml:space="preserve">10.41.22. xx</w:t>
+              <w:t xml:space="preserve">10.41.22.xx</w:t>
             </w:r>
           </w:p>
         </w:tc>
@@ -174,7 +174,7 @@
         </w:trPr>
         <w:tc>
           <w:tcPr>
-            <w:tcW w:w="3772" w:type="dxa"/>
+            <w:tcW w:w="3765" w:type="dxa"/>
             <w:gridSpan w:val="2"/>
             <w:vMerge/>
             <w:tcBorders>
@@ -287,7 +287,7 @@
         </w:trPr>
         <w:tc>
           <w:tcPr>
-            <w:tcW w:w="3772" w:type="dxa"/>
+            <w:tcW w:w="3765" w:type="dxa"/>
             <w:gridSpan w:val="2"/>
             <w:vMerge/>
             <w:tcBorders>
@@ -400,7 +400,7 @@
         </w:trPr>
         <w:tc>
           <w:tcPr>
-            <w:tcW w:w="1024" w:type="dxa"/>
+            <w:tcW w:w="1017" w:type="dxa"/>
             <w:vMerge w:val="restart"/>
             <w:tcBorders>
               <w:top w:val="single" w:sz="8" w:space="0" w:color="000000"/>
@@ -550,7 +550,7 @@
         </w:trPr>
         <w:tc>
           <w:tcPr>
-            <w:tcW w:w="1024" w:type="dxa"/>
+            <w:tcW w:w="1017" w:type="dxa"/>
             <w:vMerge/>
             <w:tcBorders>
               <w:top w:val="single" w:sz="8" w:space="0" w:color="000000"/>
@@ -684,7 +684,7 @@
         </w:trPr>
         <w:tc>
           <w:tcPr>
-            <w:tcW w:w="1024" w:type="dxa"/>
+            <w:tcW w:w="1017" w:type="dxa"/>
             <w:vMerge/>
             <w:tcBorders>
               <w:top w:val="single" w:sz="8" w:space="0" w:color="000000"/>
@@ -818,7 +818,7 @@
         </w:trPr>
         <w:tc>
           <w:tcPr>
-            <w:tcW w:w="1024" w:type="dxa"/>
+            <w:tcW w:w="1017" w:type="dxa"/>
             <w:vMerge/>
             <w:tcBorders>
               <w:top w:val="single" w:sz="8" w:space="0" w:color="000000"/>
@@ -952,7 +952,7 @@
         </w:trPr>
         <w:tc>
           <w:tcPr>
-            <w:tcW w:w="1024" w:type="dxa"/>
+            <w:tcW w:w="1017" w:type="dxa"/>
             <w:vMerge/>
             <w:tcBorders>
               <w:top w:val="single" w:sz="8" w:space="0" w:color="000000"/>
@@ -1086,7 +1086,7 @@
         </w:trPr>
         <w:tc>
           <w:tcPr>
-            <w:tcW w:w="1024" w:type="dxa"/>
+            <w:tcW w:w="1017" w:type="dxa"/>
             <w:vMerge/>
             <w:tcBorders>
               <w:top w:val="single" w:sz="8" w:space="0" w:color="000000"/>
@@ -1215,12 +1215,12 @@
       </w:tr>
       <w:tr>
         <w:trPr>
-          <w:trHeight w:val="274" w:hRule="exact"/>
+          <w:trHeight w:val="278" w:hRule="exact"/>
           <w:cantSplit/>
         </w:trPr>
         <w:tc>
           <w:tcPr>
-            <w:tcW w:w="1024" w:type="dxa"/>
+            <w:tcW w:w="1017" w:type="dxa"/>
             <w:vMerge/>
             <w:tcBorders>
               <w:top w:val="single" w:sz="8" w:space="0" w:color="000000"/>
@@ -1349,12 +1349,12 @@
       </w:tr>
       <w:tr>
         <w:trPr>
-          <w:trHeight w:val="321" w:hRule="exact"/>
+          <w:trHeight w:val="317" w:hRule="exact"/>
           <w:cantSplit/>
         </w:trPr>
         <w:tc>
           <w:tcPr>
-            <w:tcW w:w="1024" w:type="dxa"/>
+            <w:tcW w:w="1017" w:type="dxa"/>
             <w:vMerge w:val="restart"/>
             <w:tcBorders>
               <w:top w:val="single" w:sz="8" w:space="0" w:color="000000"/>
@@ -1502,7 +1502,7 @@
         </w:trPr>
         <w:tc>
           <w:tcPr>
-            <w:tcW w:w="1024" w:type="dxa"/>
+            <w:tcW w:w="1017" w:type="dxa"/>
             <w:vMerge/>
             <w:tcBorders>
               <w:top w:val="single" w:sz="8" w:space="0" w:color="000000"/>
@@ -1634,7 +1634,7 @@
         </w:trPr>
         <w:tc>
           <w:tcPr>
-            <w:tcW w:w="1024" w:type="dxa"/>
+            <w:tcW w:w="1017" w:type="dxa"/>
             <w:vMerge w:val="restart"/>
             <w:tcBorders>
               <w:top w:val="single" w:sz="8" w:space="0" w:color="000000"/>
@@ -1642,7 +1642,7 @@
               <w:bottom w:val="single" w:sz="8" w:space="0" w:color="000000"/>
               <w:right w:val="single" w:sz="8" w:space="0" w:color="000000"/>
             </w:tcBorders>
-            <w:shd w:val="clear" w:color="auto" w:fill="FDE6E2"/>
+            <w:shd w:val="clear" w:color="auto" w:fill="FBE6E2"/>
             <w:vAlign w:val="center"/>
           </w:tcPr>
           <w:p>
@@ -1784,15 +1784,15 @@
         </w:trPr>
         <w:tc>
           <w:tcPr>
-            <w:tcW w:w="1024" w:type="dxa"/>
-            <w:vMerge/>
-            <w:tcBorders>
-              <w:top w:val="single" w:sz="8" w:space="0" w:color="000000"/>
-              <w:left w:val="single" w:sz="8" w:space="0" w:color="000000"/>
-              <w:bottom w:val="single" w:sz="8" w:space="0" w:color="000000"/>
-              <w:right w:val="single" w:sz="8" w:space="0" w:color="000000"/>
-            </w:tcBorders>
-            <w:shd w:val="clear" w:color="auto" w:fill="FDE6E2"/>
+            <w:tcW w:w="1017" w:type="dxa"/>
+            <w:vMerge/>
+            <w:tcBorders>
+              <w:top w:val="single" w:sz="8" w:space="0" w:color="000000"/>
+              <w:left w:val="single" w:sz="8" w:space="0" w:color="000000"/>
+              <w:bottom w:val="single" w:sz="8" w:space="0" w:color="000000"/>
+              <w:right w:val="single" w:sz="8" w:space="0" w:color="000000"/>
+            </w:tcBorders>
+            <w:shd w:val="clear" w:color="auto" w:fill="FBE6E2"/>
             <w:vAlign w:val="center"/>
           </w:tcPr>
           <w:p>
@@ -1918,15 +1918,15 @@
         </w:trPr>
         <w:tc>
           <w:tcPr>
-            <w:tcW w:w="1024" w:type="dxa"/>
-            <w:vMerge/>
-            <w:tcBorders>
-              <w:top w:val="single" w:sz="8" w:space="0" w:color="000000"/>
-              <w:left w:val="single" w:sz="8" w:space="0" w:color="000000"/>
-              <w:bottom w:val="single" w:sz="8" w:space="0" w:color="000000"/>
-              <w:right w:val="single" w:sz="8" w:space="0" w:color="000000"/>
-            </w:tcBorders>
-            <w:shd w:val="clear" w:color="auto" w:fill="FDE6E2"/>
+            <w:tcW w:w="1017" w:type="dxa"/>
+            <w:vMerge/>
+            <w:tcBorders>
+              <w:top w:val="single" w:sz="8" w:space="0" w:color="000000"/>
+              <w:left w:val="single" w:sz="8" w:space="0" w:color="000000"/>
+              <w:bottom w:val="single" w:sz="8" w:space="0" w:color="000000"/>
+              <w:right w:val="single" w:sz="8" w:space="0" w:color="000000"/>
+            </w:tcBorders>
+            <w:shd w:val="clear" w:color="auto" w:fill="FBE6E2"/>
             <w:vAlign w:val="center"/>
           </w:tcPr>
           <w:p>
@@ -2052,15 +2052,15 @@
         </w:trPr>
         <w:tc>
           <w:tcPr>
-            <w:tcW w:w="1024" w:type="dxa"/>
-            <w:vMerge/>
-            <w:tcBorders>
-              <w:top w:val="single" w:sz="8" w:space="0" w:color="000000"/>
-              <w:left w:val="single" w:sz="8" w:space="0" w:color="000000"/>
-              <w:bottom w:val="single" w:sz="8" w:space="0" w:color="000000"/>
-              <w:right w:val="single" w:sz="8" w:space="0" w:color="000000"/>
-            </w:tcBorders>
-            <w:shd w:val="clear" w:color="auto" w:fill="FDE6E2"/>
+            <w:tcW w:w="1017" w:type="dxa"/>
+            <w:vMerge/>
+            <w:tcBorders>
+              <w:top w:val="single" w:sz="8" w:space="0" w:color="000000"/>
+              <w:left w:val="single" w:sz="8" w:space="0" w:color="000000"/>
+              <w:bottom w:val="single" w:sz="8" w:space="0" w:color="000000"/>
+              <w:right w:val="single" w:sz="8" w:space="0" w:color="000000"/>
+            </w:tcBorders>
+            <w:shd w:val="clear" w:color="auto" w:fill="FBE6E2"/>
             <w:vAlign w:val="center"/>
           </w:tcPr>
           <w:p>
@@ -2186,15 +2186,15 @@
         </w:trPr>
         <w:tc>
           <w:tcPr>
-            <w:tcW w:w="1024" w:type="dxa"/>
-            <w:vMerge/>
-            <w:tcBorders>
-              <w:top w:val="single" w:sz="8" w:space="0" w:color="000000"/>
-              <w:left w:val="single" w:sz="8" w:space="0" w:color="000000"/>
-              <w:bottom w:val="single" w:sz="8" w:space="0" w:color="000000"/>
-              <w:right w:val="single" w:sz="8" w:space="0" w:color="000000"/>
-            </w:tcBorders>
-            <w:shd w:val="clear" w:color="auto" w:fill="FDE6E2"/>
+            <w:tcW w:w="1017" w:type="dxa"/>
+            <w:vMerge/>
+            <w:tcBorders>
+              <w:top w:val="single" w:sz="8" w:space="0" w:color="000000"/>
+              <w:left w:val="single" w:sz="8" w:space="0" w:color="000000"/>
+              <w:bottom w:val="single" w:sz="8" w:space="0" w:color="000000"/>
+              <w:right w:val="single" w:sz="8" w:space="0" w:color="000000"/>
+            </w:tcBorders>
+            <w:shd w:val="clear" w:color="auto" w:fill="FBE6E2"/>
             <w:vAlign w:val="center"/>
           </w:tcPr>
           <w:p>
@@ -2320,15 +2320,15 @@
         </w:trPr>
         <w:tc>
           <w:tcPr>
-            <w:tcW w:w="1024" w:type="dxa"/>
-            <w:vMerge/>
-            <w:tcBorders>
-              <w:top w:val="single" w:sz="8" w:space="0" w:color="000000"/>
-              <w:left w:val="single" w:sz="8" w:space="0" w:color="000000"/>
-              <w:bottom w:val="single" w:sz="8" w:space="0" w:color="000000"/>
-              <w:right w:val="single" w:sz="8" w:space="0" w:color="000000"/>
-            </w:tcBorders>
-            <w:shd w:val="clear" w:color="auto" w:fill="FDE6E2"/>
+            <w:tcW w:w="1017" w:type="dxa"/>
+            <w:vMerge/>
+            <w:tcBorders>
+              <w:top w:val="single" w:sz="8" w:space="0" w:color="000000"/>
+              <w:left w:val="single" w:sz="8" w:space="0" w:color="000000"/>
+              <w:bottom w:val="single" w:sz="8" w:space="0" w:color="000000"/>
+              <w:right w:val="single" w:sz="8" w:space="0" w:color="000000"/>
+            </w:tcBorders>
+            <w:shd w:val="clear" w:color="auto" w:fill="FBE6E2"/>
             <w:vAlign w:val="center"/>
           </w:tcPr>
           <w:p>
@@ -2454,15 +2454,15 @@
         </w:trPr>
         <w:tc>
           <w:tcPr>
-            <w:tcW w:w="1024" w:type="dxa"/>
-            <w:vMerge/>
-            <w:tcBorders>
-              <w:top w:val="single" w:sz="8" w:space="0" w:color="000000"/>
-              <w:left w:val="single" w:sz="8" w:space="0" w:color="000000"/>
-              <w:bottom w:val="single" w:sz="8" w:space="0" w:color="000000"/>
-              <w:right w:val="single" w:sz="8" w:space="0" w:color="000000"/>
-            </w:tcBorders>
-            <w:shd w:val="clear" w:color="auto" w:fill="FDE6E2"/>
+            <w:tcW w:w="1017" w:type="dxa"/>
+            <w:vMerge/>
+            <w:tcBorders>
+              <w:top w:val="single" w:sz="8" w:space="0" w:color="000000"/>
+              <w:left w:val="single" w:sz="8" w:space="0" w:color="000000"/>
+              <w:bottom w:val="single" w:sz="8" w:space="0" w:color="000000"/>
+              <w:right w:val="single" w:sz="8" w:space="0" w:color="000000"/>
+            </w:tcBorders>
+            <w:shd w:val="clear" w:color="auto" w:fill="FBE6E2"/>
             <w:vAlign w:val="center"/>
           </w:tcPr>
           <w:p>
@@ -2588,7 +2588,7 @@
         </w:trPr>
         <w:tc>
           <w:tcPr>
-            <w:tcW w:w="1024" w:type="dxa"/>
+            <w:tcW w:w="1017" w:type="dxa"/>
             <w:vMerge w:val="restart"/>
             <w:tcBorders>
               <w:top w:val="single" w:sz="8" w:space="0" w:color="000000"/>
@@ -2736,7 +2736,7 @@
         </w:trPr>
         <w:tc>
           <w:tcPr>
-            <w:tcW w:w="1024" w:type="dxa"/>
+            <w:tcW w:w="1017" w:type="dxa"/>
             <w:vMerge/>
             <w:tcBorders>
               <w:top w:val="single" w:sz="8" w:space="0" w:color="000000"/>
@@ -2868,14 +2868,14 @@
         </w:trPr>
         <w:tc>
           <w:tcPr>
-            <w:tcW w:w="1024" w:type="dxa"/>
-            <w:tcBorders>
-              <w:top w:val="single" w:sz="8" w:space="0" w:color="000000"/>
-              <w:left w:val="single" w:sz="8" w:space="0" w:color="000000"/>
-              <w:bottom w:val="single" w:sz="8" w:space="0" w:color="000000"/>
-              <w:right w:val="single" w:sz="8" w:space="0" w:color="000000"/>
-            </w:tcBorders>
-            <w:shd w:val="clear" w:color="auto" w:fill="F8DF71"/>
+            <w:tcW w:w="1017" w:type="dxa"/>
+            <w:tcBorders>
+              <w:top w:val="single" w:sz="8" w:space="0" w:color="000000"/>
+              <w:left w:val="single" w:sz="8" w:space="0" w:color="000000"/>
+              <w:bottom w:val="single" w:sz="8" w:space="0" w:color="000000"/>
+              <w:right w:val="single" w:sz="8" w:space="0" w:color="000000"/>
+            </w:tcBorders>
+            <w:shd w:val="clear" w:color="auto" w:fill="F7DE72"/>
             <w:vAlign w:val="center"/>
           </w:tcPr>
           <w:p>
@@ -3043,7 +3043,7 @@
         </w:trPr>
         <w:tc>
           <w:tcPr>
-            <w:tcW w:w="1024" w:type="dxa"/>
+            <w:tcW w:w="1017" w:type="dxa"/>
             <w:vMerge w:val="restart"/>
             <w:tcBorders>
               <w:top w:val="single" w:sz="8" w:space="0" w:color="000000"/>
@@ -3217,7 +3217,7 @@
         </w:trPr>
         <w:tc>
           <w:tcPr>
-            <w:tcW w:w="1024" w:type="dxa"/>
+            <w:tcW w:w="1017" w:type="dxa"/>
             <w:vMerge/>
             <w:tcBorders>
               <w:top w:val="single" w:sz="8" w:space="0" w:color="000000"/>
@@ -3354,7 +3354,7 @@
         </w:trPr>
         <w:tc>
           <w:tcPr>
-            <w:tcW w:w="1024" w:type="dxa"/>
+            <w:tcW w:w="1017" w:type="dxa"/>
             <w:vMerge/>
             <w:tcBorders>
               <w:top w:val="single" w:sz="8" w:space="0" w:color="000000"/>
@@ -3491,7 +3491,7 @@
         </w:trPr>
         <w:tc>
           <w:tcPr>
-            <w:tcW w:w="1024" w:type="dxa"/>
+            <w:tcW w:w="1017" w:type="dxa"/>
             <w:vMerge/>
             <w:tcBorders>
               <w:top w:val="single" w:sz="8" w:space="0" w:color="000000"/>
@@ -3628,7 +3628,7 @@
         </w:trPr>
         <w:tc>
           <w:tcPr>
-            <w:tcW w:w="1024" w:type="dxa"/>
+            <w:tcW w:w="1017" w:type="dxa"/>
             <w:vMerge/>
             <w:tcBorders>
               <w:top w:val="single" w:sz="8" w:space="0" w:color="000000"/>
@@ -3765,7 +3765,7 @@
         </w:trPr>
         <w:tc>
           <w:tcPr>
-            <w:tcW w:w="1024" w:type="dxa"/>
+            <w:tcW w:w="1017" w:type="dxa"/>
             <w:vMerge/>
             <w:tcBorders>
               <w:top w:val="single" w:sz="8" w:space="0" w:color="000000"/>
@@ -3902,7 +3902,7 @@
         </w:trPr>
         <w:tc>
           <w:tcPr>
-            <w:tcW w:w="1024" w:type="dxa"/>
+            <w:tcW w:w="1017" w:type="dxa"/>
             <w:vMerge/>
             <w:tcBorders>
               <w:top w:val="single" w:sz="8" w:space="0" w:color="000000"/>
@@ -4039,7 +4039,7 @@
         </w:trPr>
         <w:tc>
           <w:tcPr>
-            <w:tcW w:w="1024" w:type="dxa"/>
+            <w:tcW w:w="1017" w:type="dxa"/>
             <w:vMerge/>
             <w:tcBorders>
               <w:top w:val="single" w:sz="8" w:space="0" w:color="000000"/>
@@ -4173,7 +4173,7 @@
     <w:p>
       <w:pPr>
         <w:spacing w:before="3972" w:after="0" w:line="528" w:lineRule="atLeast"/>
-        <w:ind w:left="3512"/>
+        <w:ind w:left="3506"/>
       </w:pPr>
       <w:r>
         <w:rPr>
@@ -4195,7 +4195,7 @@
     </w:p>
     <w:sectPr>
       <w:pgSz w:w="12240" w:h="15840"/>
-      <w:pgMar w:top="1269" w:right="1123" w:bottom="360" w:left="1014" w:header="0" w:footer="0" w:gutter="0"/>
+      <w:pgMar w:top="1269" w:right="1123" w:bottom="360" w:left="1020" w:header="0" w:footer="0" w:gutter="0"/>
     </w:sectPr>
   </w:body>
 </w:document>

</xml_diff>